<commit_message>
Carta ABS: precisar facultades del firmante del Anexo 4 (vigencia SUNARP STYWI)
Co-Authored-By: Claude Opus 5.5 <noreply@anthropic.com>
Claude-Session: https://claude.ai/code/session_01Ls5dNjYBLNjXxuGTDk7v3H
</commit_message>
<xml_diff>
--- a/carta-reclamo/Carta_Reclamo_Acreditacion_CAMPECHANO_ABS.docx
+++ b/carta-reclamo/Carta_Reclamo_Acreditacion_CAMPECHANO_ABS.docx
@@ -636,7 +636,17 @@
               <w:jc w:val="left"/>
             </w:pPr>
             <w:r>
-              <w:t xml:space="preserve">Acreditamos que el firmante es el</w:t>
+              <w:t xml:space="preserve">Acreditamos que el firmante, Sr. </w:t>
+            </w:r>
+            <w:r>
+              <w:rPr>
+                <w:bCs/>
+                <w:b/>
+              </w:rPr>
+              <w:t xml:space="preserve">Manuel Antonio Miñan Huerto</w:t>
+            </w:r>
+            <w:r>
+              <w:t xml:space="preserve">, es</w:t>
             </w:r>
             <w:r>
               <w:t xml:space="preserve"> </w:t>
@@ -649,7 +659,23 @@
               <w:t xml:space="preserve">Gerente General de STYWI S.A.C.</w:t>
             </w:r>
             <w:r>
-              <w:t xml:space="preserve">, empresa de propiedad de los</w:t>
+              <w:t xml:space="preserve">, cuyos</w:t>
+            </w:r>
+            <w:r>
+              <w:t xml:space="preserve"> </w:t>
+            </w:r>
+            <w:r>
+              <w:rPr>
+                <w:bCs/>
+                <w:b/>
+              </w:rPr>
+              <w:t xml:space="preserve">únicos socios (50 % cada uno) y directores</w:t>
+            </w:r>
+            <w:r>
+              <w:t xml:space="preserve"> </w:t>
+            </w:r>
+            <w:r>
+              <w:t xml:space="preserve">son los</w:t>
             </w:r>
             <w:r>
               <w:t xml:space="preserve"> </w:t>
@@ -662,7 +688,7 @@
               <w:t xml:space="preserve">titulares registrados de la marca</w:t>
             </w:r>
             <w:r>
-              <w:t xml:space="preserve">, el Sr. William Nadim Majluf Tuma y la Sra. Stephanie Farah Ode. Adjuntamos la</w:t>
+              <w:t xml:space="preserve">, el Sr. William Nadim Majluf Tuma y la Sra. Stephanie Farah Ode (Ficha RUC adjunta). Adjuntamos además el</w:t>
             </w:r>
             <w:r>
               <w:t xml:space="preserve"> </w:t>
@@ -672,13 +698,13 @@
                 <w:bCs/>
                 <w:b/>
               </w:rPr>
-              <w:t xml:space="preserve">Ficha RUC</w:t>
+              <w:t xml:space="preserve">Certificado de Vigencia de SUNARP</w:t>
             </w:r>
             <w:r>
               <w:t xml:space="preserve"> </w:t>
             </w:r>
             <w:r>
-              <w:t xml:space="preserve">y la</w:t>
+              <w:t xml:space="preserve">(partida electrónica N.° 13409955, Oficina Registral de Lima), en el que constan sus facultades</w:t>
             </w:r>
             <w:r>
               <w:t xml:space="preserve"> </w:t>
@@ -688,10 +714,72 @@
                 <w:bCs/>
                 <w:b/>
               </w:rPr>
-              <w:t xml:space="preserve">Vigencia de Poder</w:t>
-            </w:r>
-            <w:r>
-              <w:t xml:space="preserve">, en la que constan sus facultades de representación ante INDECOPI.</w:t>
+              <w:t xml:space="preserve">a sola firma</w:t>
+            </w:r>
+            <w:r>
+              <w:t xml:space="preserve"> </w:t>
+            </w:r>
+            <w:r>
+              <w:t xml:space="preserve">para representar</w:t>
+            </w:r>
+            <w:r>
+              <w:t xml:space="preserve"> </w:t>
+            </w:r>
+            <w:r>
+              <w:rPr>
+                <w:bCs/>
+                <w:b/>
+              </w:rPr>
+              <w:t xml:space="preserve">ante INDECOPI</w:t>
+            </w:r>
+            <w:r>
+              <w:t xml:space="preserve"> </w:t>
+            </w:r>
+            <w:r>
+              <w:t xml:space="preserve">y, en particular,</w:t>
+            </w:r>
+            <w:r>
+              <w:t xml:space="preserve"> </w:t>
+            </w:r>
+            <w:r>
+              <w:rPr>
+                <w:bCs/>
+                <w:b/>
+              </w:rPr>
+              <w:t xml:space="preserve">“</w:t>
+            </w:r>
+            <w:r>
+              <w:rPr>
+                <w:bCs/>
+                <w:b/>
+              </w:rPr>
+              <w:t xml:space="preserve">en todos los asuntos relacionados con los derechos de propiedad intelectual</w:t>
+            </w:r>
+            <w:r>
+              <w:rPr>
+                <w:bCs/>
+                <w:b/>
+              </w:rPr>
+              <w:t xml:space="preserve">”</w:t>
+            </w:r>
+            <w:r>
+              <w:t xml:space="preserve">, incluidos los</w:t>
+            </w:r>
+            <w:r>
+              <w:t xml:space="preserve"> </w:t>
+            </w:r>
+            <w:r>
+              <w:rPr>
+                <w:bCs/>
+                <w:b/>
+              </w:rPr>
+              <w:t xml:space="preserve">registros y renovaciones de marcas</w:t>
+            </w:r>
+            <w:r>
+              <w:t xml:space="preserve"> </w:t>
+            </w:r>
+            <w:r>
+              <w:t xml:space="preserve">(facultad 17).</w:t>
             </w:r>
           </w:p>
         </w:tc>

</xml_diff>

<commit_message>
Carta ABS: anexar vigencia de poder de STYWI S.A.C.
Co-Authored-By: Claude Opus 5.5 <noreply@anthropic.com>
Claude-Session: https://claude.ai/code/session_01Ls5dNjYBLNjXxuGTDk7v3H
</commit_message>
<xml_diff>
--- a/carta-reclamo/Carta_Reclamo_Acreditacion_CAMPECHANO_ABS.docx
+++ b/carta-reclamo/Carta_Reclamo_Acreditacion_CAMPECHANO_ABS.docx
@@ -704,7 +704,7 @@
               <w:t xml:space="preserve"> </w:t>
             </w:r>
             <w:r>
-              <w:t xml:space="preserve">(partida electrónica N.° 13409955, Oficina Registral de Lima), en el que constan sus facultades</w:t>
+              <w:t xml:space="preserve">(partida electrónica N.° 13409955, Oficina Registral de Lima – ver Anexo 5), en el que constan sus facultades</w:t>
             </w:r>
             <w:r>
               <w:t xml:space="preserve"> </w:t>
@@ -1726,7 +1726,7 @@
       </w:r>
     </w:p>
     <w:bookmarkEnd w:id="22"/>
-    <w:bookmarkStart w:id="47" w:name="reserva-de-derechos"/>
+    <w:bookmarkStart w:id="56" w:name="reserva-de-derechos"/>
     <w:p>
       <w:pPr>
         <w:pStyle w:val="Heading2"/>
@@ -1983,6 +1983,28 @@
       </w:r>
       <w:r>
         <w:t xml:space="preserve">Correos de seguimiento del 31 de agosto y del 10 de septiembre de 2026.</w:t>
+      </w:r>
+    </w:p>
+    <w:p>
+      <w:pPr>
+        <w:numPr>
+          <w:ilvl w:val="0"/>
+          <w:numId w:val="1004"/>
+        </w:numPr>
+        <w:pStyle w:val="Compact"/>
+      </w:pPr>
+      <w:r>
+        <w:rPr>
+          <w:bCs/>
+          <w:b/>
+        </w:rPr>
+        <w:t xml:space="preserve">Anexo 5:</w:t>
+      </w:r>
+      <w:r>
+        <w:t xml:space="preserve"> </w:t>
+      </w:r>
+      <w:r>
+        <w:t xml:space="preserve">Certificado de Vigencia de SUNARP de STYWI S.A.C. (partida electrónica N.° 13409955, Lima), que acredita las facultades del Sr. Manuel Antonio Miñan Huerto, incluida su representación ante INDECOPI.</w:t>
       </w:r>
     </w:p>
     <w:p>
@@ -2429,7 +2451,234 @@
         <w:t xml:space="preserve">Anexo 4 – Correos de seguimiento del 31 de agosto de 2026 y del 10 de septiembre de 2026, sin respuesta.</w:t>
       </w:r>
     </w:p>
-    <w:bookmarkEnd w:id="47"/>
+    <w:p>
+      <w:r>
+        <w:br w:type="page"/>
+      </w:r>
+    </w:p>
+    <w:p>
+      <w:pPr>
+        <w:pStyle w:val="BodyText"/>
+      </w:pPr>
+      <w:r>
+        <w:drawing>
+          <wp:inline>
+            <wp:extent cx="4679999" cy="6608571"/>
+            <wp:effectExtent b="0" l="0" r="0" t="0"/>
+            <wp:docPr descr="" title="" id="48" name="Picture"/>
+            <a:graphic>
+              <a:graphicData uri="http://schemas.openxmlformats.org/drawingml/2006/picture">
+                <pic:pic>
+                  <pic:nvPicPr>
+                    <pic:cNvPr descr="anexos_abs/a6_vigencia_stywi_p1-1.png" id="49" name="Picture"/>
+                    <pic:cNvPicPr>
+                      <a:picLocks noChangeArrowheads="1" noChangeAspect="1"/>
+                    </pic:cNvPicPr>
+                  </pic:nvPicPr>
+                  <pic:blipFill>
+                    <a:blip r:embed="rId47"/>
+                    <a:stretch>
+                      <a:fillRect/>
+                    </a:stretch>
+                  </pic:blipFill>
+                  <pic:spPr bwMode="auto">
+                    <a:xfrm>
+                      <a:off x="0" y="0"/>
+                      <a:ext cx="4679999" cy="6608571"/>
+                    </a:xfrm>
+                    <a:prstGeom prst="rect">
+                      <a:avLst/>
+                    </a:prstGeom>
+                    <a:noFill/>
+                    <a:ln w="9525">
+                      <a:noFill/>
+                      <a:headEnd/>
+                      <a:tailEnd/>
+                    </a:ln>
+                  </pic:spPr>
+                </pic:pic>
+              </a:graphicData>
+            </a:graphic>
+          </wp:inline>
+        </w:drawing>
+      </w:r>
+    </w:p>
+    <w:p>
+      <w:pPr>
+        <w:pStyle w:val="BodyText"/>
+      </w:pPr>
+      <w:r>
+        <w:rPr>
+          <w:bCs/>
+          <w:b/>
+        </w:rPr>
+        <w:t xml:space="preserve">Anexo 5 – Certificado de Vigencia de SUNARP de STYWI S.A.C. (partida N.° 13409955): nombramiento de Manuel Antonio Miñan Huerto como Gerente General, a sola firma, con facultad de representación ante INDECOPI (facultad 7).</w:t>
+      </w:r>
+    </w:p>
+    <w:p>
+      <w:r>
+        <w:br w:type="page"/>
+      </w:r>
+    </w:p>
+    <w:p>
+      <w:pPr>
+        <w:pStyle w:val="BodyText"/>
+      </w:pPr>
+      <w:r>
+        <w:drawing>
+          <wp:inline>
+            <wp:extent cx="4679999" cy="6608571"/>
+            <wp:effectExtent b="0" l="0" r="0" t="0"/>
+            <wp:docPr descr="" title="" id="51" name="Picture"/>
+            <a:graphic>
+              <a:graphicData uri="http://schemas.openxmlformats.org/drawingml/2006/picture">
+                <pic:pic>
+                  <pic:nvPicPr>
+                    <pic:cNvPr descr="anexos_abs/a6_vigencia_stywi_p2-2.png" id="52" name="Picture"/>
+                    <pic:cNvPicPr>
+                      <a:picLocks noChangeArrowheads="1" noChangeAspect="1"/>
+                    </pic:cNvPicPr>
+                  </pic:nvPicPr>
+                  <pic:blipFill>
+                    <a:blip r:embed="rId50"/>
+                    <a:stretch>
+                      <a:fillRect/>
+                    </a:stretch>
+                  </pic:blipFill>
+                  <pic:spPr bwMode="auto">
+                    <a:xfrm>
+                      <a:off x="0" y="0"/>
+                      <a:ext cx="4679999" cy="6608571"/>
+                    </a:xfrm>
+                    <a:prstGeom prst="rect">
+                      <a:avLst/>
+                    </a:prstGeom>
+                    <a:noFill/>
+                    <a:ln w="9525">
+                      <a:noFill/>
+                      <a:headEnd/>
+                      <a:tailEnd/>
+                    </a:ln>
+                  </pic:spPr>
+                </pic:pic>
+              </a:graphicData>
+            </a:graphic>
+          </wp:inline>
+        </w:drawing>
+      </w:r>
+    </w:p>
+    <w:p>
+      <w:pPr>
+        <w:pStyle w:val="BodyText"/>
+      </w:pPr>
+      <w:r>
+        <w:rPr>
+          <w:bCs/>
+          <w:b/>
+        </w:rPr>
+        <w:t xml:space="preserve">Anexo 5 (cont.) – Facultad 17: representación</w:t>
+      </w:r>
+      <w:r>
+        <w:rPr>
+          <w:bCs/>
+          <w:b/>
+        </w:rPr>
+        <w:t xml:space="preserve"> </w:t>
+      </w:r>
+      <w:r>
+        <w:rPr>
+          <w:bCs/>
+          <w:b/>
+        </w:rPr>
+        <w:t xml:space="preserve">“</w:t>
+      </w:r>
+      <w:r>
+        <w:rPr>
+          <w:bCs/>
+          <w:b/>
+        </w:rPr>
+        <w:t xml:space="preserve">en todos los asuntos relacionados con los derechos de propiedad intelectual</w:t>
+      </w:r>
+      <w:r>
+        <w:rPr>
+          <w:bCs/>
+          <w:b/>
+        </w:rPr>
+        <w:t xml:space="preserve">”</w:t>
+      </w:r>
+      <w:r>
+        <w:rPr>
+          <w:bCs/>
+          <w:b/>
+        </w:rPr>
+        <w:t xml:space="preserve">, incluidos registros y renovaciones de marcas.</w:t>
+      </w:r>
+    </w:p>
+    <w:p>
+      <w:r>
+        <w:br w:type="page"/>
+      </w:r>
+    </w:p>
+    <w:p>
+      <w:pPr>
+        <w:pStyle w:val="BodyText"/>
+      </w:pPr>
+      <w:r>
+        <w:drawing>
+          <wp:inline>
+            <wp:extent cx="4679999" cy="6608571"/>
+            <wp:effectExtent b="0" l="0" r="0" t="0"/>
+            <wp:docPr descr="" title="" id="54" name="Picture"/>
+            <a:graphic>
+              <a:graphicData uri="http://schemas.openxmlformats.org/drawingml/2006/picture">
+                <pic:pic>
+                  <pic:nvPicPr>
+                    <pic:cNvPr descr="anexos_abs/a6_vigencia_stywi_p3-3.png" id="55" name="Picture"/>
+                    <pic:cNvPicPr>
+                      <a:picLocks noChangeArrowheads="1" noChangeAspect="1"/>
+                    </pic:cNvPicPr>
+                  </pic:nvPicPr>
+                  <pic:blipFill>
+                    <a:blip r:embed="rId53"/>
+                    <a:stretch>
+                      <a:fillRect/>
+                    </a:stretch>
+                  </pic:blipFill>
+                  <pic:spPr bwMode="auto">
+                    <a:xfrm>
+                      <a:off x="0" y="0"/>
+                      <a:ext cx="4679999" cy="6608571"/>
+                    </a:xfrm>
+                    <a:prstGeom prst="rect">
+                      <a:avLst/>
+                    </a:prstGeom>
+                    <a:noFill/>
+                    <a:ln w="9525">
+                      <a:noFill/>
+                      <a:headEnd/>
+                      <a:tailEnd/>
+                    </a:ln>
+                  </pic:spPr>
+                </pic:pic>
+              </a:graphicData>
+            </a:graphic>
+          </wp:inline>
+        </w:drawing>
+      </w:r>
+    </w:p>
+    <w:p>
+      <w:pPr>
+        <w:pStyle w:val="BodyText"/>
+      </w:pPr>
+      <w:r>
+        <w:rPr>
+          <w:bCs/>
+          <w:b/>
+        </w:rPr>
+        <w:t xml:space="preserve">Anexo 5 (cont.) – Ampliación de facultades del Gerente General (asiento C00002).</w:t>
+      </w:r>
+    </w:p>
+    <w:bookmarkEnd w:id="56"/>
     <w:sectPr/>
   </w:body>
 </w:document>

</xml_diff>